<commit_message>
Account page: add Restore Purchases + FAQ rows, fix chevron color, add Settings chevron, hide desktop scrollbar
- Added Restore Purchases (after Muse Pro divider) and FAQ (after Send
  Feedback) list rows to the Account page in both v1 and v2, matching
  Figma node 121:1000.
- Converted the row-trailing chevron from an img+filter hack to an
  inline SVG with fill: var(--n14, #212127), matching Figma's updated
  Neutral/Dark/14 color, and added it to the Settings row too.
- Fixed the Account screen's scroll container to hide its native
  scrollbar on desktop, matching every other screen's .scr-scroll
  convention.
- Logged the change in docs/YCMuse_Prototype_Update_Log.docx.
</commit_message>
<xml_diff>
--- a/docs/YCMuse_Prototype_Update_Log.docx
+++ b/docs/YCMuse_Prototype_Update_Log.docx
@@ -74,7 +74,7 @@
           <w:sz w:val="18"/>
           <w:szCs w:val="18"/>
         </w:rPr>
-        <w:t>August 13, 2026</w:t>
+        <w:t>August 26, 2026</w:t>
       </w:r>
       <w:r>
         <w:rPr>
@@ -278,6 +278,255 @@
                 <w:szCs w:val="17"/>
               </w:rPr>
               <w:t>Fix</w:t>
+            </w:r>
+          </w:p>
+        </w:tc>
+      </w:tr>
+    </w:tbl>
+    <w:p>
+      <w:pPr>
+        <w:pBdr>
+          <w:bottom w:val="single" w:sz="8" w:space="4" w:color="A855F7"/>
+        </w:pBdr>
+        <w:spacing w:before="360" w:after="120"/>
+      </w:pPr>
+      <w:r>
+        <w:rPr>
+          <w:rFonts w:ascii="Arial" w:eastAsia="Arial" w:hAnsi="Arial" w:cs="Arial"/>
+          <w:color w:val="9CA3AF"/>
+          <w:sz w:val="22"/>
+          <w:szCs w:val="22"/>
+        </w:rPr>
+        <w:t xml:space="preserve">Updates — </w:t>
+      </w:r>
+      <w:r>
+        <w:rPr>
+          <w:rFonts w:ascii="Arial" w:eastAsia="Arial" w:hAnsi="Arial" w:cs="Arial"/>
+          <w:b/>
+          <w:bCs/>
+          <w:color w:val="111827"/>
+          <w:sz w:val="22"/>
+          <w:szCs w:val="22"/>
+        </w:rPr>
+        <w:t>August 26, 2026</w:t>
+      </w:r>
+    </w:p>
+    <w:tbl>
+      <w:tblPr>
+        <w:tblW w:w="10080" w:type="dxa"/>
+        <w:tblBorders>
+          <w:top w:val="single" w:sz="4" w:space="0" w:color="auto"/>
+          <w:left w:val="single" w:sz="4" w:space="0" w:color="auto"/>
+          <w:bottom w:val="single" w:sz="4" w:space="0" w:color="auto"/>
+          <w:right w:val="single" w:sz="4" w:space="0" w:color="auto"/>
+          <w:insideH w:val="single" w:sz="4" w:space="0" w:color="auto"/>
+          <w:insideV w:val="single" w:sz="4" w:space="0" w:color="auto"/>
+        </w:tblBorders>
+        <w:tblCellMar>
+          <w:left w:w="10" w:type="dxa"/>
+          <w:right w:w="10" w:type="dxa"/>
+        </w:tblCellMar>
+        <w:tblLook w:val="04A0" w:firstRow="1" w:lastRow="0" w:firstColumn="1" w:lastColumn="0" w:noHBand="0" w:noVBand="1"/>
+      </w:tblPr>
+      <w:tblGrid>
+        <w:gridCol w:w="2500"/>
+        <w:gridCol w:w="960"/>
+        <w:gridCol w:w="6620"/>
+      </w:tblGrid>
+      <w:tr>
+        <w:trPr>
+          <w:tblHeader/>
+        </w:trPr>
+        <w:tc>
+          <w:tcPr>
+            <w:tcW w:w="2500" w:type="dxa"/>
+            <w:tcBorders>
+              <w:top w:val="none" w:sz="0" w:space="0" w:color="FFFFFF"/>
+              <w:left w:val="none" w:sz="0" w:space="0" w:color="FFFFFF"/>
+              <w:bottom w:val="none" w:sz="0" w:space="0" w:color="FFFFFF"/>
+              <w:right w:val="none" w:sz="0" w:space="0" w:color="FFFFFF"/>
+            </w:tcBorders>
+            <w:shd w:val="clear" w:color="auto" w:fill="1F1535"/>
+            <w:tcMar>
+              <w:top w:w="110" w:type="dxa"/>
+              <w:left w:w="140" w:type="dxa"/>
+              <w:bottom w:w="110" w:type="dxa"/>
+              <w:right w:w="140" w:type="dxa"/>
+            </w:tcMar>
+            <w:vAlign w:val="center"/>
+          </w:tcPr>
+          <w:p>
+            <w:r>
+              <w:rPr>
+                <w:rFonts w:ascii="Arial" w:eastAsia="Arial" w:hAnsi="Arial" w:cs="Arial"/>
+                <w:b/>
+                <w:bCs/>
+                <w:color w:val="FFFFFF"/>
+                <w:sz w:val="18"/>
+                <w:szCs w:val="18"/>
+              </w:rPr>
+              <w:t>Screen / Area</w:t>
+            </w:r>
+          </w:p>
+        </w:tc>
+        <w:tc>
+          <w:tcPr>
+            <w:tcW w:w="960" w:type="dxa"/>
+            <w:tcBorders>
+              <w:top w:val="none" w:sz="0" w:space="0" w:color="FFFFFF"/>
+              <w:left w:val="none" w:sz="0" w:space="0" w:color="FFFFFF"/>
+              <w:bottom w:val="none" w:sz="0" w:space="0" w:color="FFFFFF"/>
+              <w:right w:val="none" w:sz="0" w:space="0" w:color="FFFFFF"/>
+            </w:tcBorders>
+            <w:shd w:val="clear" w:color="auto" w:fill="1F1535"/>
+            <w:tcMar>
+              <w:top w:w="110" w:type="dxa"/>
+              <w:left w:w="140" w:type="dxa"/>
+              <w:bottom w:w="110" w:type="dxa"/>
+              <w:right w:w="140" w:type="dxa"/>
+            </w:tcMar>
+            <w:vAlign w:val="center"/>
+          </w:tcPr>
+          <w:p>
+            <w:r>
+              <w:rPr>
+                <w:rFonts w:ascii="Arial" w:eastAsia="Arial" w:hAnsi="Arial" w:cs="Arial"/>
+                <w:b/>
+                <w:bCs/>
+                <w:color w:val="FFFFFF"/>
+                <w:sz w:val="18"/>
+                <w:szCs w:val="18"/>
+              </w:rPr>
+              <w:t>Type</w:t>
+            </w:r>
+          </w:p>
+        </w:tc>
+        <w:tc>
+          <w:tcPr>
+            <w:tcW w:w="6620" w:type="dxa"/>
+            <w:tcBorders>
+              <w:top w:val="none" w:sz="0" w:space="0" w:color="FFFFFF"/>
+              <w:left w:val="none" w:sz="0" w:space="0" w:color="FFFFFF"/>
+              <w:bottom w:val="none" w:sz="0" w:space="0" w:color="FFFFFF"/>
+              <w:right w:val="none" w:sz="0" w:space="0" w:color="FFFFFF"/>
+            </w:tcBorders>
+            <w:shd w:val="clear" w:color="auto" w:fill="1F1535"/>
+            <w:tcMar>
+              <w:top w:w="110" w:type="dxa"/>
+              <w:left w:w="140" w:type="dxa"/>
+              <w:bottom w:w="110" w:type="dxa"/>
+              <w:right w:w="140" w:type="dxa"/>
+            </w:tcMar>
+            <w:vAlign w:val="center"/>
+          </w:tcPr>
+          <w:p>
+            <w:r>
+              <w:rPr>
+                <w:rFonts w:ascii="Arial" w:eastAsia="Arial" w:hAnsi="Arial" w:cs="Arial"/>
+                <w:b/>
+                <w:bCs/>
+                <w:color w:val="FFFFFF"/>
+                <w:sz w:val="18"/>
+                <w:szCs w:val="18"/>
+              </w:rPr>
+              <w:t>Description</w:t>
+            </w:r>
+          </w:p>
+        </w:tc>
+      </w:tr>
+      <w:tr>
+        <w:tc>
+          <w:tcPr>
+            <w:tcW w:w="2500" w:type="dxa"/>
+            <w:tcBorders>
+              <w:top w:val="single" w:sz="1" w:space="0" w:color="E5E7EB"/>
+              <w:left w:val="single" w:sz="1" w:space="0" w:color="E5E7EB"/>
+              <w:bottom w:val="single" w:sz="1" w:space="0" w:color="E5E7EB"/>
+              <w:right w:val="single" w:sz="1" w:space="0" w:color="E5E7EB"/>
+            </w:tcBorders>
+            <w:shd w:val="clear" w:color="auto" w:fill="FAFAFA"/>
+            <w:tcMar>
+              <w:top w:w="100" w:type="dxa"/>
+              <w:left w:w="140" w:type="dxa"/>
+              <w:bottom w:w="100" w:type="dxa"/>
+              <w:right w:w="140" w:type="dxa"/>
+            </w:tcMar>
+            <w:vAlign w:val="center"/>
+          </w:tcPr>
+          <w:p>
+            <w:r>
+              <w:rPr>
+                <w:rFonts w:ascii="Arial" w:eastAsia="Arial" w:hAnsi="Arial" w:cs="Arial"/>
+                <w:color w:val="1F2937"/>
+                <w:sz w:val="18"/>
+                <w:szCs w:val="18"/>
+              </w:rPr>
+              <w:t>Account — List Items</w:t>
+            </w:r>
+          </w:p>
+        </w:tc>
+        <w:tc>
+          <w:tcPr>
+            <w:tcW w:w="960" w:type="dxa"/>
+            <w:tcBorders>
+              <w:top w:val="single" w:sz="1" w:space="0" w:color="E5E7EB"/>
+              <w:left w:val="single" w:sz="1" w:space="0" w:color="E5E7EB"/>
+              <w:bottom w:val="single" w:sz="1" w:space="0" w:color="E5E7EB"/>
+              <w:right w:val="single" w:sz="1" w:space="0" w:color="E5E7EB"/>
+            </w:tcBorders>
+            <w:shd w:val="clear" w:color="auto" w:fill="FEF9C3"/>
+            <w:tcMar>
+              <w:top w:w="100" w:type="dxa"/>
+              <w:left w:w="80" w:type="dxa"/>
+              <w:bottom w:w="100" w:type="dxa"/>
+              <w:right w:w="80" w:type="dxa"/>
+            </w:tcMar>
+            <w:vAlign w:val="center"/>
+          </w:tcPr>
+          <w:p>
+            <w:pPr>
+              <w:jc w:val="center"/>
+            </w:pPr>
+            <w:r>
+              <w:rPr>
+                <w:rFonts w:ascii="Arial" w:eastAsia="Arial" w:hAnsi="Arial" w:cs="Arial"/>
+                <w:b/>
+                <w:bCs/>
+                <w:color w:val="854D0E"/>
+                <w:sz w:val="17"/>
+                <w:szCs w:val="17"/>
+              </w:rPr>
+              <w:t>UI</w:t>
+            </w:r>
+          </w:p>
+        </w:tc>
+        <w:tc>
+          <w:tcPr>
+            <w:tcW w:w="6620" w:type="dxa"/>
+            <w:tcBorders>
+              <w:top w:val="single" w:sz="1" w:space="0" w:color="E5E7EB"/>
+              <w:left w:val="single" w:sz="1" w:space="0" w:color="E5E7EB"/>
+              <w:bottom w:val="single" w:sz="1" w:space="0" w:color="E5E7EB"/>
+              <w:right w:val="single" w:sz="1" w:space="0" w:color="E5E7EB"/>
+            </w:tcBorders>
+            <w:shd w:val="clear" w:color="auto" w:fill="FAFAFA"/>
+            <w:tcMar>
+              <w:top w:w="100" w:type="dxa"/>
+              <w:left w:w="140" w:type="dxa"/>
+              <w:bottom w:w="100" w:type="dxa"/>
+              <w:right w:w="140" w:type="dxa"/>
+            </w:tcMar>
+            <w:vAlign w:val="center"/>
+          </w:tcPr>
+          <w:p>
+            <w:r>
+              <w:rPr>
+                <w:rFonts w:ascii="Arial" w:eastAsia="Arial" w:hAnsi="Arial" w:cs="Arial"/>
+                <w:color w:val="4B5563"/>
+                <w:sz w:val="18"/>
+                <w:szCs w:val="18"/>
+              </w:rPr>
+              <w:t>Added Restore Purchases and FAQ rows to the account list (Restore Purchases after Muse Pro, FAQ after Send Feedback), matching updated Figma.</w:t>
             </w:r>
           </w:p>
         </w:tc>

</xml_diff>